<commit_message>
docs: actualiza datos del estudiante
</commit_message>
<xml_diff>
--- a/memoria_entrega_poo.docx
+++ b/memoria_entrega_poo.docx
@@ -61,18 +61,18 @@
           <w:sz w:val="22"/>
           <w:sz-cs w:val="22"/>
         </w:rPr>
-        <w:t xml:space="preserve">Estudiante: [COMPLETAR]</w:t>
-      </w:r>
-    </w:p>
-    <w:p>
-      <w:pPr/>
-      <w:r>
-        <w:rPr>
-          <w:rFonts w:ascii="Helvetica" w:hAnsi="Helvetica" w:cs="Helvetica"/>
-          <w:sz w:val="22"/>
-          <w:sz-cs w:val="22"/>
-        </w:rPr>
-        <w:t xml:space="preserve">Matricula: [COMPLETAR]</w:t>
+        <w:t xml:space="preserve">Estudiante: Edisson Carchi</w:t>
+      </w:r>
+    </w:p>
+    <w:p>
+      <w:pPr/>
+      <w:r>
+        <w:rPr>
+          <w:rFonts w:ascii="Helvetica" w:hAnsi="Helvetica" w:cs="Helvetica"/>
+          <w:sz w:val="22"/>
+          <w:sz-cs w:val="22"/>
+        </w:rPr>
+        <w:t xml:space="preserve">Matricula: [PENDIENTE DE CONFIRMAR]</w:t>
       </w:r>
     </w:p>
     <w:p>

</xml_diff>

<commit_message>
docs: corrige redaccion y ortografia
</commit_message>
<xml_diff>
--- a/memoria_entrega_poo.docx
+++ b/memoria_entrega_poo.docx
@@ -11,7 +11,7 @@
           <w:sz-cs w:val="28"/>
           <w:b/>
         </w:rPr>
-        <w:t xml:space="preserve">Actividad Semanas 1 y 2: POO, UML, Herencia y Composicion</w:t>
+        <w:t xml:space="preserve">Actividad Semanas 1 y 2: POO, UML, Herencia y ComposiciÃ³n</w:t>
       </w:r>
       <w:r>
         <w:rPr>
@@ -72,18 +72,18 @@
           <w:sz w:val="22"/>
           <w:sz-cs w:val="22"/>
         </w:rPr>
-        <w:t xml:space="preserve">Matricula: 2025372938</w:t>
-      </w:r>
-    </w:p>
-    <w:p>
-      <w:pPr/>
-      <w:r>
-        <w:rPr>
-          <w:rFonts w:ascii="Helvetica" w:hAnsi="Helvetica" w:cs="Helvetica"/>
-          <w:sz w:val="22"/>
-          <w:sz-cs w:val="22"/>
-        </w:rPr>
-        <w:t xml:space="preserve">Asignatura: Programacion Orientada a Objetos</w:t>
+        <w:t xml:space="preserve">MatrÃ­cula: 2025372938</w:t>
+      </w:r>
+    </w:p>
+    <w:p>
+      <w:pPr/>
+      <w:r>
+        <w:rPr>
+          <w:rFonts w:ascii="Helvetica" w:hAnsi="Helvetica" w:cs="Helvetica"/>
+          <w:sz w:val="22"/>
+          <w:sz-cs w:val="22"/>
+        </w:rPr>
+        <w:t xml:space="preserve">Asignatura: ProgramaciÃ³n Orientada a Objetos</w:t>
       </w:r>
     </w:p>
     <w:p>
@@ -147,7 +147,7 @@
           <w:sz w:val="22"/>
           <w:sz-cs w:val="22"/>
         </w:rPr>
-        <w:t xml:space="preserve">Se implemento un sistema de biblioteca que registra materiales, usuarios y prestamos. Se selecciono este caso porque permite demostrar encapsulacion, getters y setters, herencia y composicion en un flujo funcional.</w:t>
+        <w:t xml:space="preserve">Se implementÃ³ un sistema de biblioteca que registra materiales, usuarios y prÃ©stamos. Se seleccionÃ³ este caso porque permite demostrar encapsulaciÃ³n, getters y setters, herencia y composiciÃ³n en un flujo funcional.</w:t>
       </w:r>
     </w:p>
     <w:p>
@@ -189,7 +189,7 @@
           <w:sz w:val="22"/>
           <w:sz-cs w:val="22"/>
         </w:rPr>
-        <w:t xml:space="preserve">Las clases Persona y Material son clases base. Sus atributos se almacenan privados con doble guion bajo y se consultan o modifican mediante propiedades @property, que funcionan como getters y setters. La validacion evita identificaciones vacias, correos invalidos, titulos vacios y estados incorrectos.</w:t>
+        <w:t xml:space="preserve">Las clases Persona y Material son clases base. Sus atributos se almacenan privados con doble guion bajo y se consultan o modifican mediante propiedades @property, que funcionan como getters y setters. La validaciÃ³n evita identificaciones vacÃ­as, correos invÃ¡lidos, tÃ­tulos vacÃ­os y estados incorrectos.</w:t>
       </w:r>
     </w:p>
     <w:p>
@@ -231,7 +231,7 @@
           <w:sz w:val="22"/>
           <w:sz-cs w:val="22"/>
         </w:rPr>
-        <w:t xml:space="preserve">Usuario y Bibliotecario heredan de Persona. Libro y Revista heredan de Material. Las subclases reutilizan el comportamiento comun y agregan datos propios: Libro incorpora autor e ISBN, mientras Revista incorpora numero de edicion.</w:t>
+        <w:t xml:space="preserve">Usuario y Bibliotecario heredan de Persona. Libro y Revista heredan de Material. Las subclases reutilizan el comportamiento comÃºn y agregan datos propios: Libro incorpora autor e ISBN, mientras Revista incorpora nÃºmero de ediciÃ³n.</w:t>
       </w:r>
     </w:p>
     <w:p>
@@ -273,7 +273,7 @@
           <w:sz w:val="22"/>
           <w:sz-cs w:val="22"/>
         </w:rPr>
-        <w:t xml:space="preserve">Biblioteca compone un Catalogo, un diccionario de usuarios y una coleccion de prestamos. El Catalogo administra los materiales y Prestamo relaciona un Usuario con un Material. El metodo prestar valida, cambia el estado del material, crea el prestamo y lo registra; devolver cierra el prestamo y libera el material.</w:t>
+        <w:t xml:space="preserve">Biblioteca compone un CatÃ¡logo, un diccionario de usuarios y una colecciÃ³n de prÃ©stamos. El CatÃ¡logo administra los materiales y PrÃ©stamo relaciona un Usuario con un Material. El mÃ©todo prestar valida, cambia el estado del material, crea el prÃ©stamo y lo registra; devolver cierra el prÃ©stamo y libera el material.</w:t>
       </w:r>
     </w:p>
     <w:p>
@@ -487,7 +487,7 @@
           <w:sz w:val="22"/>
           <w:sz-cs w:val="22"/>
         </w:rPr>
-        <w:t xml:space="preserve">La solucion separa responsabilidades: los materiales controlan su disponibilidad, las personas mantienen sus datos y la biblioteca coordina las operaciones. La herencia evita duplicar atributos comunes y la composicion permite que la biblioteca administre el catalogo y los prestamos. El uso de atributos privados y validaciones protege el estado interno y facilita que el codigo pueda ampliarse con nuevos tipos de materiales o roles sin modificar el flujo principal.</w:t>
+        <w:t xml:space="preserve">La soluciÃ³n separa responsabilidades: los materiales controlan su disponibilidad, las personas mantienen sus datos y la biblioteca coordina las operaciones. La herencia evita duplicar atributos comunes y la composiciÃ³n permite que la biblioteca administre el catÃ¡logo y los prÃ©stamos. El uso de atributos privados y validaciones protege el estado interno y facilita que el cÃ³digo pueda ampliarse con nuevos tipos de materiales o roles sin modificar el flujo principal.</w:t>
       </w:r>
     </w:p>
     <w:sectPr>

</xml_diff>